<commit_message>
docs(RUN_REPORT.docx): regenerate with new Grafana dashboard screenshot
</commit_message>
<xml_diff>
--- a/RUN_REPORT.docx
+++ b/RUN_REPORT.docx
@@ -2521,7 +2521,7 @@
       <w:r>
         <w:drawing>
           <wp:inline xmlns:a="http://schemas.openxmlformats.org/drawingml/2006/main" xmlns:pic="http://schemas.openxmlformats.org/drawingml/2006/picture">
-            <wp:extent cx="5486400" cy="4877752"/>
+            <wp:extent cx="5486400" cy="3429000"/>
             <wp:docPr id="2" name="Picture 2"/>
             <wp:cNvGraphicFramePr>
               <a:graphicFrameLocks noChangeAspect="1"/>
@@ -2542,7 +2542,7 @@
                   <pic:spPr>
                     <a:xfrm>
                       <a:off x="0" y="0"/>
-                      <a:ext cx="5486400" cy="4877752"/>
+                      <a:ext cx="5486400" cy="3429000"/>
                     </a:xfrm>
                     <a:prstGeom prst="rect"/>
                   </pic:spPr>

</xml_diff>

<commit_message>
refactor: rename k3d/ to kind/, sweep k3d references, remove REPRODUCIBILITY Task 10
</commit_message>
<xml_diff>
--- a/RUN_REPORT.docx
+++ b/RUN_REPORT.docx
@@ -1471,47 +1471,37 @@
     </w:p>
     <w:p>
       <w:r>
-        <w:t xml:space="preserve">access. Pivoted from </w:t>
+        <w:t xml:space="preserve">access. The cluster is configured without </w:t>
       </w:r>
       <w:r>
         <w:rPr>
           <w:rFonts w:ascii="Consolas" w:hAnsi="Consolas"/>
           <w:sz w:val="20"/>
         </w:rPr>
-        <w:t>k3d</w:t>
-      </w:r>
-      <w:r>
-        <w:t xml:space="preserve"> because </w:t>
+        <w:t>extraPortMappings</w:t>
+      </w:r>
+      <w:r>
+        <w:t xml:space="preserve"> because</w:t>
+      </w:r>
+    </w:p>
+    <w:p>
+      <w:r>
+        <w:t>kind refused to start on this host with the host-port mappings; ingress</w:t>
+      </w:r>
+    </w:p>
+    <w:p>
+      <w:r>
+        <w:t xml:space="preserve">is reached through the Traefik NodePort or </w:t>
       </w:r>
       <w:r>
         <w:rPr>
           <w:rFonts w:ascii="Consolas" w:hAnsi="Consolas"/>
           <w:sz w:val="20"/>
         </w:rPr>
-        <w:t>ghcr.io/k3d-io/k3d-tools</w:t>
-      </w:r>
-      <w:r>
-        <w:t xml:space="preserve"> is</w:t>
-      </w:r>
-    </w:p>
-    <w:p>
-      <w:r>
-        <w:t xml:space="preserve">blocked on this host, and from </w:t>
-      </w:r>
-      <w:r>
-        <w:rPr>
-          <w:rFonts w:ascii="Consolas" w:hAnsi="Consolas"/>
-          <w:sz w:val="20"/>
-        </w:rPr>
-        <w:t>kind extraPortMappings</w:t>
-      </w:r>
-      <w:r>
-        <w:t xml:space="preserve"> to Traefik</w:t>
-      </w:r>
-    </w:p>
-    <w:p>
-      <w:r>
-        <w:t>NodePort because kind refused to start with the host-port mappings.</w:t>
+        <w:t>kubectl port-forward</w:t>
+      </w:r>
+      <w:r>
+        <w:t>.</w:t>
       </w:r>
     </w:p>
     <w:p/>

</xml_diff>